<commit_message>
Upgrade figS1 to 2x2 four-model PR panel (M3/M4 weights pulled from cloud, all mAP reproduced); Springer format compliance (no in-figure titles, 600dpi); purge orphan image rels; rebuild ESM_1
</commit_message>
<xml_diff>
--- a/paper/Supplementary_Material_v5.docx
+++ b/paper/Supplementary_Material_v5.docx
@@ -29,7 +29,7 @@
       <w:r>
         <w:drawing>
           <wp:inline xmlns:a="http://schemas.openxmlformats.org/drawingml/2006/main" xmlns:pic="http://schemas.openxmlformats.org/drawingml/2006/picture">
-            <wp:extent cx="5669280" cy="2093854"/>
+            <wp:extent cx="5669280" cy="4198891"/>
             <wp:docPr id="1" name="Picture 1"/>
             <wp:cNvGraphicFramePr>
               <a:graphicFrameLocks noChangeAspect="1"/>
@@ -42,7 +42,7 @@
                     <pic:cNvPicPr/>
                   </pic:nvPicPr>
                   <pic:blipFill>
-                    <a:blip r:embed="rId9"/>
+                    <a:blip r:embed="rId12"/>
                     <a:stretch>
                       <a:fillRect/>
                     </a:stretch>
@@ -50,7 +50,7 @@
                   <pic:spPr>
                     <a:xfrm>
                       <a:off x="0" y="0"/>
-                      <a:ext cx="5669280" cy="2093854"/>
+                      <a:ext cx="5669280" cy="4198891"/>
                     </a:xfrm>
                     <a:prstGeom prst="rect"/>
                   </pic:spPr>
@@ -69,14 +69,14 @@
         <w:rPr>
           <w:sz w:val="18"/>
         </w:rPr>
-        <w:t>Fig. S1 Precision–recall curves on the held-out test set for the baseline (left) and the final lightweight model M5 (right). Behaviour-class curves are shown thin; the thick blue curve is the all-class average (mAP50 in the legend)</w:t>
+        <w:t>Fig. S1 Precision–recall curves on the held-out test set for the four ablation models: (a) baseline YOLOv11n (mAP50 0.596), (b) M3 FasterNet-only (0.569), (c) M4 sampling-only (0.604), (d) final M5 (0.593). Behaviour-class curves are shown thin; the thick blue curve is the all-class average</w:t>
       </w:r>
     </w:p>
     <w:p>
       <w:r>
         <w:drawing>
           <wp:inline xmlns:a="http://schemas.openxmlformats.org/drawingml/2006/main" xmlns:pic="http://schemas.openxmlformats.org/drawingml/2006/picture">
-            <wp:extent cx="5669280" cy="2565736"/>
+            <wp:extent cx="5669280" cy="2571700"/>
             <wp:docPr id="2" name="Picture 2"/>
             <wp:cNvGraphicFramePr>
               <a:graphicFrameLocks noChangeAspect="1"/>
@@ -89,7 +89,7 @@
                     <pic:cNvPicPr/>
                   </pic:nvPicPr>
                   <pic:blipFill>
-                    <a:blip r:embed="rId10"/>
+                    <a:blip r:embed="rId13"/>
                     <a:stretch>
                       <a:fillRect/>
                     </a:stretch>
@@ -97,7 +97,7 @@
                   <pic:spPr>
                     <a:xfrm>
                       <a:off x="0" y="0"/>
-                      <a:ext cx="5669280" cy="2565736"/>
+                      <a:ext cx="5669280" cy="2571700"/>
                     </a:xfrm>
                     <a:prstGeom prst="rect"/>
                   </pic:spPr>
@@ -123,7 +123,7 @@
       <w:r>
         <w:drawing>
           <wp:inline xmlns:a="http://schemas.openxmlformats.org/drawingml/2006/main" xmlns:pic="http://schemas.openxmlformats.org/drawingml/2006/picture">
-            <wp:extent cx="5669280" cy="2461881"/>
+            <wp:extent cx="5669280" cy="2317482"/>
             <wp:docPr id="3" name="Picture 3"/>
             <wp:cNvGraphicFramePr>
               <a:graphicFrameLocks noChangeAspect="1"/>
@@ -136,7 +136,7 @@
                     <pic:cNvPicPr/>
                   </pic:nvPicPr>
                   <pic:blipFill>
-                    <a:blip r:embed="rId11"/>
+                    <a:blip r:embed="rId14"/>
                     <a:stretch>
                       <a:fillRect/>
                     </a:stretch>
@@ -144,7 +144,7 @@
                   <pic:spPr>
                     <a:xfrm>
                       <a:off x="0" y="0"/>
-                      <a:ext cx="5669280" cy="2461881"/>
+                      <a:ext cx="5669280" cy="2317482"/>
                     </a:xfrm>
                     <a:prstGeom prst="rect"/>
                   </pic:spPr>

</xml_diff>